<commit_message>
Update request with family court decision details, post-stay collection and counsel signature
Co-Authored-By: Claude Opus 5.5 <noreply@anthropic.com>
Claude-Session: https://claude.ai/code/session_0146b2p6uVfEhef5hKqsoxFD
</commit_message>
<xml_diff>
--- a/execution-stay-request/בקשה_ליישום_עיכוב_הליכים_והפסקת_עיקול.docx
+++ b/execution-stay-request/בקשה_ליישום_עיכוב_הליכים_והפסקת_עיקול.docx
@@ -120,7 +120,23 @@
           <w:szCs w:val="24"/>
           <w:rtl/>
         </w:rPr>
-        <w:t xml:space="preserve">באביי בילילין, ת"ז 328811385, טל' 052-6078005</w:t>
+        <w:t xml:space="preserve">באביי בילילין, ת"ז 328811385</w:t>
+      </w:r>
+    </w:p>
+    <w:p>
+      <w:pPr>
+        <w:bidi/>
+        <w:spacing w:after="0"/>
+        <w:jc w:val="start"/>
+      </w:pPr>
+      <w:r>
+        <w:rPr>
+          <w:rFonts w:ascii="David" w:cs="David" w:eastAsia="David" w:hAnsi="David"/>
+          <w:sz w:val="24"/>
+          <w:szCs w:val="24"/>
+          <w:rtl/>
+        </w:rPr>
+        <w:t xml:space="preserve">ע"י ב"כ עו"ד סולומון טקה</w:t>
       </w:r>
     </w:p>
     <w:p>
@@ -147,7 +163,7 @@
           <w:szCs w:val="24"/>
           <w:rtl/>
         </w:rPr>
-        <w:t xml:space="preserve">המוסד לביטוח לאומי (מזונות)</w:t>
+        <w:t xml:space="preserve">המוסד לביטוח לאומי</w:t>
       </w:r>
     </w:p>
     <w:p>
@@ -166,7 +182,7 @@
           <w:u w:val="single"/>
           <w:rtl/>
         </w:rPr>
-        <w:t xml:space="preserve">בקשה דחופה להפסקת ההליכים, העיקול והגדלת החוב בתיק</w:t>
+        <w:t xml:space="preserve">בקשה דחופה ליישום החלטת עיכוב ההליכים, להשבת כספים ולהפסקת הגדלת החוב</w:t>
       </w:r>
     </w:p>
     <w:p>
@@ -187,7 +203,7 @@
           <w:szCs w:val="24"/>
           <w:rtl/>
         </w:rPr>
-        <w:t xml:space="preserve">ביום [__________] הורה בית המשפט לעניני משפחה ב[__________] (תיק [__________]) על עיכוב ההליכים בתיק זה. ההחלטה מצורפת.</w:t>
+        <w:t xml:space="preserve">ביום 18.8.2026 הורה בית המשפט לענייני משפחה בראשון לציון (כב' השופטת מירב אליהו, תמ"ש 49199-09-23, בקשה מס' 13) "על עיכוב הליכים בתיק ההוצאה לפועל כמבוקש". ההחלטה מצורפת.</w:t>
       </w:r>
     </w:p>
     <w:p>
@@ -229,7 +245,7 @@
           <w:szCs w:val="24"/>
           <w:rtl/>
         </w:rPr>
-        <w:t xml:space="preserve">למרות זאת, העיקול על חשבון הבנק המשותף למבקש ולרעייתו (בנק הפועלים, סניף 768, חשבון 474964) ממשיך לפעול, וכספים ממשיכים לרדת ממנו על חשבון המבקש ועל חשבון רעייתו, שאינה חייבת בתיק.</w:t>
+        <w:t xml:space="preserve">למרות זאת, ביום 15.9.2026, כחודש לאחר מתן העיכוב, מומש העיקול בחשבון הבנק המשותף למבקש ולרעייתו (בנק הפועלים, סניף 768, חשבון 474964), ונגבה ממנו לתיק סך של 8,869 ₪. מדובר בפעולת גבייה שנעשתה בניגוד מפורש להחלטת בית המשפט, ושפוגעת גם ברעייתו של המבקש, שאינה חייבת בתיק.</w:t>
       </w:r>
     </w:p>
     <w:p>
@@ -250,7 +266,7 @@
           <w:szCs w:val="24"/>
           <w:rtl/>
         </w:rPr>
-        <w:t xml:space="preserve">בנוסף, החוב בתיק תופח מדי יום. המבקש אינו מבין מדוע גדלה קרן החוב בזמן שההליכים מעוכבים על פי החלטת בית המשפט.</w:t>
+        <w:t xml:space="preserve">בנוסף, ביום 22.9.2026 הוגדלה קרן החוב בתיק בסך של 3,431 ₪, ויתרת החוב המעודכנת עומדת על 101,996 ₪, לעומת חוב מקורי של 52,728 ₪. המבקש אינו מבין על מה נסמכת הגדלת החוב בזמן שההליכים מעוכבים, ומצב זה מרוקן את העיכוב מתוכנו.</w:t>
       </w:r>
     </w:p>
     <w:p>
@@ -292,7 +308,7 @@
           <w:szCs w:val="24"/>
           <w:rtl/>
         </w:rPr>
-        <w:t xml:space="preserve">לפיכך מתבקשת כבוד הרשמת להורות על הפסקת כל ההליכים בתיק, לרבות העיקול בחשבון המשותף והודעה על כך לבנק, ועל הפסקת הגדלת החוב. לחלופין, להורות על המצאת פירוט חוב המסביר כל סכום שנוסף לחוב מאז העיכוב.</w:t>
+        <w:t xml:space="preserve">לפיכך מתבקשת כבוד הרשמת להורות: (א) על הפסקה מיידית של כל ההליכים בתיק, לרבות העיקול בחשבון המשותף, ועל הודעה על כך לבנק; (ב) על השבת סך 8,869 ₪ שנגבה ביום 15.9.2026 לחשבון המשותף; (ג) על הפסקת הגדלת החוב בתקופת העיכוב, ולחלופין על המצאת פירוט של כל סכום שנוסף לחוב מאז 18.8.2026 ומקורו, ועל ביטול כל אגרה או הוצאה שנרשמו בשל פעולות אכיפה לאחר מועד זה.</w:t>
       </w:r>
     </w:p>
     <w:tbl>
@@ -397,7 +413,25 @@
                 <w:szCs w:val="24"/>
                 <w:rtl/>
               </w:rPr>
-              <w:t xml:space="preserve">באביי בילילין, המבקש</w:t>
+              <w:t xml:space="preserve">סולומון טקה, עו"ד</w:t>
+            </w:r>
+          </w:p>
+          <w:p>
+            <w:pPr>
+              <w:bidi/>
+              <w:spacing w:after="40"/>
+              <w:jc w:val="end"/>
+            </w:pPr>
+            <w:r>
+              <w:rPr>
+                <w:rFonts w:ascii="David" w:cs="David" w:eastAsia="David" w:hAnsi="David"/>
+                <w:b/>
+                <w:bCs/>
+                <w:sz w:val="24"/>
+                <w:szCs w:val="24"/>
+                <w:rtl/>
+              </w:rPr>
+              <w:t xml:space="preserve">ב"כ המבקש</w:t>
             </w:r>
           </w:p>
         </w:tc>
@@ -427,7 +461,7 @@
           <w:szCs w:val="24"/>
           <w:rtl/>
         </w:rPr>
-        <w:t xml:space="preserve">העתק החלטת בית המשפט לעניני משפחה בדבר עיכוב ההליכים.</w:t>
+        <w:t xml:space="preserve">העתק החלטת בית המשפט לענייני משפחה בראשון לציון מיום 18.8.2026.</w:t>
       </w:r>
     </w:p>
     <w:sectPr>

</xml_diff>

<commit_message>
Ground debt-freeze argument in the pending motion to set aside the ex parte maintenance judgment
Co-Authored-By: Claude Opus 5.5 <noreply@anthropic.com>
Claude-Session: https://claude.ai/code/session_0146b2p6uVfEhef5hKqsoxFD
</commit_message>
<xml_diff>
--- a/execution-stay-request/בקשה_ליישום_עיכוב_הליכים_והפסקת_עיקול.docx
+++ b/execution-stay-request/בקשה_ליישום_עיכוב_הליכים_והפסקת_עיקול.docx
@@ -203,7 +203,7 @@
           <w:szCs w:val="24"/>
           <w:rtl/>
         </w:rPr>
-        <w:t xml:space="preserve">ביום 18.8.2026 הורה בית המשפט לענייני משפחה בראשון לציון (כב' השופטת מירב אליהו, תמ"ש 49199-09-23, בקשה מס' 13) "על עיכוב הליכים בתיק ההוצאה לפועל כמבוקש". ההחלטה מצורפת.</w:t>
+        <w:t xml:space="preserve">ביום 18.8.2026 הורה בית המשפט לענייני משפחה בראשון לציון (כב' השופטת מירב אליהו, תמ"ש 49199-09-23, בקשה מס' 13) "על עיכוב הליכים בתיק ההוצאה לפועל כמבוקש". ההחלטה ניתנה במסגרת ההליך לביטול פסק הדין למזונות שניתן נגד המבקש במעמד צד אחד ביום 24.12.2023, בעת ששירת במילואים, ובו עתר המבקש גם לעיכוב ביצועו של פסק הדין. ההחלטה מצורפת.</w:t>
       </w:r>
     </w:p>
     <w:p>
@@ -266,7 +266,7 @@
           <w:szCs w:val="24"/>
           <w:rtl/>
         </w:rPr>
-        <w:t xml:space="preserve">בנוסף, ביום 22.9.2026 הוגדלה קרן החוב בתיק בסך של 3,431 ₪, ויתרת החוב המעודכנת עומדת על 101,996 ₪, לעומת חוב מקורי של 52,728 ₪. המבקש אינו מבין על מה נסמכת הגדלת החוב בזמן שההליכים מעוכבים, ומצב זה מרוקן את העיכוב מתוכנו.</w:t>
+        <w:t xml:space="preserve">בנוסף, ביום 22.9.2026 הוגדלה קרן החוב בתיק בסך של 3,431 ₪, ויתרת החוב המעודכנת עומדת על 101,996 ₪, לעומת חוב מקורי של 52,728 ₪. הגדלת הקרן מכוח פסק דין שתוקפו עומד לבירור, ושההליכים לביצועו מעוכבים, היא עצמה פעולת ביצוע של פסק הדין, והיא מרוקנת את העיכוב מתוכנו.</w:t>
       </w:r>
     </w:p>
     <w:p>

</xml_diff>

<commit_message>
Add clause on the debtor's financial hardship; drop redundant clause
Co-Authored-By: Claude Opus 5.5 <noreply@anthropic.com>
Claude-Session: https://claude.ai/code/session_0146b2p6uVfEhef5hKqsoxFD
</commit_message>
<xml_diff>
--- a/execution-stay-request/בקשה_ליישום_עיכוב_הליכים_והפסקת_עיקול.docx
+++ b/execution-stay-request/בקשה_ליישום_עיכוב_הליכים_והפסקת_עיקול.docx
@@ -266,7 +266,7 @@
           <w:szCs w:val="24"/>
           <w:rtl/>
         </w:rPr>
-        <w:t xml:space="preserve">בנוסף, ביום 22.9.2026 הוגדלה קרן החוב בתיק בסך של 3,431 ₪, ויתרת החוב המעודכנת עומדת על 101,996 ₪, לעומת חוב מקורי של 52,728 ₪. הגדלת הקרן מכוח פסק דין שתוקפו עומד לבירור, ושההליכים לביצועו מעוכבים, היא עצמה פעולת ביצוע של פסק הדין, והיא מרוקנת את העיכוב מתוכנו.</w:t>
+        <w:t xml:space="preserve">כתוצאה מכך המבקש ומשפחתו חנוקים כלכלית. החשבון המשותף חסום כליל, והמבקש אינו יכול למשוך ממנו דבר. המצב הגיע עד כדי כך שאין בידו אפילו 50 ₪ לתדלוק רכבו, והוא נאלץ להתקיים מהלוואות מבני משפחתו.</w:t>
       </w:r>
     </w:p>
     <w:p>
@@ -287,7 +287,7 @@
           <w:szCs w:val="24"/>
           <w:rtl/>
         </w:rPr>
-        <w:t xml:space="preserve">אין מדובר בבקשה לדון מחדש בחוב, אלא בבקשה ליישם בפועל החלטה קיימת, שכבוד הרשמת כבר הכירה בה.</w:t>
+        <w:t xml:space="preserve">בנוסף, ביום 22.9.2026 הוגדלה קרן החוב בתיק בסך של 3,431 ₪, ויתרת החוב המעודכנת עומדת על 101,996 ₪, לעומת חוב מקורי של 52,728 ₪. הגדלת הקרן מכוח פסק דין שתוקפו עומד לבירור, ושההליכים לביצועו מעוכבים, היא עצמה פעולת ביצוע של פסק הדין, והיא מרוקנת את העיכוב מתוכנו.</w:t>
       </w:r>
     </w:p>
     <w:p>

</xml_diff>